<commit_message>
docs: expand knowhub.docx to deep specs and fix CI docker build secrets conditional
</commit_message>
<xml_diff>
--- a/knowhub.docx
+++ b/knowhub.docx
@@ -4,18 +4,16 @@
   <w:body>
     <w:p>
       <w:pPr>
+        <w:spacing w:before="2000"/>
         <w:jc w:val="center"/>
       </w:pPr>
       <w:r>
         <w:rPr>
+          <w:rFonts w:ascii="Arial" w:hAnsi="Arial"/>
           <w:b/>
           <w:color w:val="1B365D"/>
-          <w:sz w:val="64"/>
+          <w:sz w:val="72"/>
         </w:rPr>
-        <w:br/>
-        <w:br/>
-        <w:br/>
-        <w:br/>
         <w:t>KNOWHUB</w:t>
         <w:br/>
       </w:r>
@@ -26,30 +24,31 @@
       </w:pPr>
       <w:r>
         <w:rPr>
+          <w:rFonts w:ascii="Georgia" w:hAnsi="Georgia"/>
           <w:i/>
           <w:color w:val="708090"/>
           <w:sz w:val="28"/>
         </w:rPr>
-        <w:t>Comprehensive In-Depth System Design &amp; Technical Specification</w:t>
+        <w:t>In-Depth System Design, Engineering Specifications, and Concept Mapping</w:t>
         <w:br/>
         <w:br/>
       </w:r>
     </w:p>
     <w:p>
       <w:pPr>
+        <w:spacing w:before="3000"/>
         <w:jc w:val="center"/>
       </w:pPr>
       <w:r>
         <w:rPr>
+          <w:rFonts w:ascii="Georgia" w:hAnsi="Georgia"/>
           <w:sz w:val="22"/>
         </w:rPr>
-        <w:t>An Advanced Knowledge-Sharing Platform with Multi-Model Persistence</w:t>
+        <w:t>A Production-Grade Knowledge-Sharing Engine</w:t>
         <w:br/>
+        <w:t>Leveraging Multi-Model Persistence (SQL, Document, Graph, Vector),</w:t>
         <w:br/>
-        <w:br/>
-        <w:br/>
-        <w:br/>
-        <w:br/>
+        <w:t>Asynchronous Communication, Real-Time WebSockets, and Strict Security Protocols.</w:t>
         <w:br/>
       </w:r>
     </w:p>
@@ -61,425 +60,178 @@
     <w:p>
       <w:pPr>
         <w:pStyle w:val="Heading1"/>
+        <w:keepNext/>
+        <w:spacing w:before="240" w:after="120"/>
       </w:pPr>
       <w:r>
         <w:rPr>
+          <w:rFonts w:ascii="Arial" w:hAnsi="Arial"/>
           <w:b/>
           <w:color w:val="1B365D"/>
           <w:sz w:val="32"/>
         </w:rPr>
-        <w:t>1. Problem Statement &amp; Functional Requirements</w:t>
-      </w:r>
-    </w:p>
-    <w:p>
-      <w:r>
-        <w:t>Modern knowledge platforms such as Stack Overflow, Quora, and Medium face unique scaling challenges. They must serve highly personalized feeds in real-time, rank thousands of answers dynamically based on user votes, index complex textual content for semantic search, and manage a highly connected social graph of follower-following relations. The system must handle massive write loads (upvotes, comments, question posts) and even larger read loads (feed viewing, searches).</w:t>
-      </w:r>
-    </w:p>
-    <w:p>
-      <w:r>
-        <w:t>Key requirements addressed by this design:</w:t>
-      </w:r>
-    </w:p>
-    <w:p>
-      <w:r>
-        <w:t>• User authentication and profiles with follow/unfollow capabilities.</w:t>
-      </w:r>
-    </w:p>
-    <w:p>
-      <w:r>
-        <w:t>• Real-time feed construction leveraging hybrid push-pull pipelines to solve the celebrity update bottleneck.</w:t>
-      </w:r>
-    </w:p>
-    <w:p>
-      <w:r>
-        <w:t>• Answer posting with statistically robust Wilson Score Interval sorting.</w:t>
-      </w:r>
-    </w:p>
-    <w:p>
-      <w:r>
-        <w:t>• Hybrid Search Fusion combining exact keyword matching (lexical) and context-aware understanding (semantic).</w:t>
-      </w:r>
-    </w:p>
-    <w:p>
-      <w:r>
-        <w:t>• Real-time notifications delivered over persistent WebSocket connections.</w:t>
+        <w:t>1. Executive Overview &amp; Problem Statement</w:t>
       </w:r>
     </w:p>
     <w:p>
       <w:pPr>
-        <w:spacing w:after="240"/>
-      </w:pPr>
-    </w:p>
-    <w:p>
-      <w:pPr>
-        <w:pStyle w:val="Heading1"/>
+        <w:spacing w:line="276" w:lineRule="auto" w:after="120"/>
       </w:pPr>
       <w:r>
         <w:rPr>
-          <w:color w:val="1B365D"/>
+          <w:rFonts w:ascii="Georgia" w:hAnsi="Georgia"/>
+          <w:sz w:val="21"/>
         </w:rPr>
-        <w:t>2. The Multi-Database Solution &amp; Technical Rationale</w:t>
-      </w:r>
-    </w:p>
-    <w:p>
-      <w:r>
-        <w:t>To model real-world scale, KnowHub employs a polyglot persistence architecture. A single database cannot efficiently serve transactional tables, deep graph traversals, and vector searches simultaneously. Thus, we decompose persistence into four core engines:</w:t>
-      </w:r>
-    </w:p>
-    <w:tbl>
-      <w:tblPr>
-        <w:tblW w:type="auto" w:w="0"/>
-        <w:jc w:val="center"/>
-        <w:tblLook w:firstColumn="1" w:firstRow="1" w:lastColumn="0" w:lastRow="0" w:noHBand="0" w:noVBand="1" w:val="04A0"/>
-      </w:tblPr>
-      <w:tblGrid>
-        <w:gridCol w:w="3120"/>
-        <w:gridCol w:w="3120"/>
-        <w:gridCol w:w="3120"/>
-      </w:tblGrid>
-      <w:tr>
-        <w:tc>
-          <w:tcPr>
-            <w:tcW w:type="dxa" w:w="3120"/>
-            <w:shd w:fill="1B365D"/>
-            <w:tcMar>
-              <w:top w:w="100" w:type="dxa"/>
-              <w:bottom w:w="100" w:type="dxa"/>
-              <w:left w:w="150" w:type="dxa"/>
-              <w:right w:w="150" w:type="dxa"/>
-            </w:tcMar>
-          </w:tcPr>
-          <w:p>
-            <w:r>
-              <w:rPr>
-                <w:b/>
-                <w:color w:val="FFFFFF"/>
-              </w:rPr>
-              <w:t>Storage Layer</w:t>
-            </w:r>
-          </w:p>
-        </w:tc>
-        <w:tc>
-          <w:tcPr>
-            <w:tcW w:type="dxa" w:w="3120"/>
-            <w:shd w:fill="1B365D"/>
-            <w:tcMar>
-              <w:top w:w="100" w:type="dxa"/>
-              <w:bottom w:w="100" w:type="dxa"/>
-              <w:left w:w="150" w:type="dxa"/>
-              <w:right w:w="150" w:type="dxa"/>
-            </w:tcMar>
-          </w:tcPr>
-          <w:p>
-            <w:r>
-              <w:rPr>
-                <w:b/>
-                <w:color w:val="FFFFFF"/>
-              </w:rPr>
-              <w:t>Technical Fit</w:t>
-            </w:r>
-          </w:p>
-        </w:tc>
-        <w:tc>
-          <w:tcPr>
-            <w:tcW w:type="dxa" w:w="3120"/>
-            <w:shd w:fill="1B365D"/>
-            <w:tcMar>
-              <w:top w:w="100" w:type="dxa"/>
-              <w:bottom w:w="100" w:type="dxa"/>
-              <w:left w:w="150" w:type="dxa"/>
-              <w:right w:w="150" w:type="dxa"/>
-            </w:tcMar>
-          </w:tcPr>
-          <w:p>
-            <w:r>
-              <w:rPr>
-                <w:b/>
-                <w:color w:val="FFFFFF"/>
-              </w:rPr>
-              <w:t>Design Rationale</w:t>
-            </w:r>
-          </w:p>
-        </w:tc>
-      </w:tr>
-      <w:tr>
-        <w:tc>
-          <w:tcPr>
-            <w:tcW w:type="dxa" w:w="3120"/>
-            <w:tcMar>
-              <w:top w:w="100" w:type="dxa"/>
-              <w:bottom w:w="100" w:type="dxa"/>
-              <w:left w:w="150" w:type="dxa"/>
-              <w:right w:w="150" w:type="dxa"/>
-            </w:tcMar>
-          </w:tcPr>
-          <w:p>
-            <w:r>
-              <w:t>SQL Database</w:t>
-            </w:r>
-          </w:p>
-        </w:tc>
-        <w:tc>
-          <w:tcPr>
-            <w:tcW w:type="dxa" w:w="3120"/>
-            <w:tcMar>
-              <w:top w:w="100" w:type="dxa"/>
-              <w:bottom w:w="100" w:type="dxa"/>
-              <w:left w:w="150" w:type="dxa"/>
-              <w:right w:w="150" w:type="dxa"/>
-            </w:tcMar>
-          </w:tcPr>
-          <w:p>
-            <w:r>
-              <w:t>SQLite / PostgreSQL</w:t>
-            </w:r>
-          </w:p>
-        </w:tc>
-        <w:tc>
-          <w:tcPr>
-            <w:tcW w:type="dxa" w:w="3120"/>
-            <w:tcMar>
-              <w:top w:w="100" w:type="dxa"/>
-              <w:bottom w:w="100" w:type="dxa"/>
-              <w:left w:w="150" w:type="dxa"/>
-              <w:right w:w="150" w:type="dxa"/>
-            </w:tcMar>
-          </w:tcPr>
-          <w:p>
-            <w:r>
-              <w:t>Stores ACID-compliant tables (Users, Topics, Questions) where foreign keys and unique constraints are paramount.</w:t>
-            </w:r>
-          </w:p>
-        </w:tc>
-      </w:tr>
-      <w:tr>
-        <w:tc>
-          <w:tcPr>
-            <w:tcW w:type="dxa" w:w="3120"/>
-            <w:tcMar>
-              <w:top w:w="100" w:type="dxa"/>
-              <w:bottom w:w="100" w:type="dxa"/>
-              <w:left w:w="150" w:type="dxa"/>
-              <w:right w:w="150" w:type="dxa"/>
-            </w:tcMar>
-            <w:shd w:fill="F2F4F7"/>
-          </w:tcPr>
-          <w:p>
-            <w:r>
-              <w:t>NoSQL Partitioned Store</w:t>
-            </w:r>
-          </w:p>
-        </w:tc>
-        <w:tc>
-          <w:tcPr>
-            <w:tcW w:type="dxa" w:w="3120"/>
-            <w:tcMar>
-              <w:top w:w="100" w:type="dxa"/>
-              <w:bottom w:w="100" w:type="dxa"/>
-              <w:left w:w="150" w:type="dxa"/>
-              <w:right w:w="150" w:type="dxa"/>
-            </w:tcMar>
-            <w:shd w:fill="F2F4F7"/>
-          </w:tcPr>
-          <w:p>
-            <w:r>
-              <w:t>Apache Cassandra</w:t>
-            </w:r>
-          </w:p>
-        </w:tc>
-        <w:tc>
-          <w:tcPr>
-            <w:tcW w:type="dxa" w:w="3120"/>
-            <w:tcMar>
-              <w:top w:w="100" w:type="dxa"/>
-              <w:bottom w:w="100" w:type="dxa"/>
-              <w:left w:w="150" w:type="dxa"/>
-              <w:right w:w="150" w:type="dxa"/>
-            </w:tcMar>
-            <w:shd w:fill="F2F4F7"/>
-          </w:tcPr>
-          <w:p>
-            <w:r>
-              <w:t>Stores Answers and Comments as partitioned document trees. Organizes data into hash folders by parent ID for O(1) query speeds.</w:t>
-            </w:r>
-          </w:p>
-        </w:tc>
-      </w:tr>
-      <w:tr>
-        <w:tc>
-          <w:tcPr>
-            <w:tcW w:type="dxa" w:w="3120"/>
-            <w:tcMar>
-              <w:top w:w="100" w:type="dxa"/>
-              <w:bottom w:w="100" w:type="dxa"/>
-              <w:left w:w="150" w:type="dxa"/>
-              <w:right w:w="150" w:type="dxa"/>
-            </w:tcMar>
-          </w:tcPr>
-          <w:p>
-            <w:r>
-              <w:t>Graph Database</w:t>
-            </w:r>
-          </w:p>
-        </w:tc>
-        <w:tc>
-          <w:tcPr>
-            <w:tcW w:type="dxa" w:w="3120"/>
-            <w:tcMar>
-              <w:top w:w="100" w:type="dxa"/>
-              <w:bottom w:w="100" w:type="dxa"/>
-              <w:left w:w="150" w:type="dxa"/>
-              <w:right w:w="150" w:type="dxa"/>
-            </w:tcMar>
-          </w:tcPr>
-          <w:p>
-            <w:r>
-              <w:t>Neo4j / Graph List</w:t>
-            </w:r>
-          </w:p>
-        </w:tc>
-        <w:tc>
-          <w:tcPr>
-            <w:tcW w:type="dxa" w:w="3120"/>
-            <w:tcMar>
-              <w:top w:w="100" w:type="dxa"/>
-              <w:bottom w:w="100" w:type="dxa"/>
-              <w:left w:w="150" w:type="dxa"/>
-              <w:right w:w="150" w:type="dxa"/>
-            </w:tcMar>
-          </w:tcPr>
-          <w:p>
-            <w:r>
-              <w:t>Maintains User-User follows and User-Topic follows. Ideal for computing recommendations using graph traversals.</w:t>
-            </w:r>
-          </w:p>
-        </w:tc>
-      </w:tr>
-      <w:tr>
-        <w:tc>
-          <w:tcPr>
-            <w:tcW w:type="dxa" w:w="3120"/>
-            <w:tcMar>
-              <w:top w:w="100" w:type="dxa"/>
-              <w:bottom w:w="100" w:type="dxa"/>
-              <w:left w:w="150" w:type="dxa"/>
-              <w:right w:w="150" w:type="dxa"/>
-            </w:tcMar>
-            <w:shd w:fill="F2F4F7"/>
-          </w:tcPr>
-          <w:p>
-            <w:r>
-              <w:t>Vector Database</w:t>
-            </w:r>
-          </w:p>
-        </w:tc>
-        <w:tc>
-          <w:tcPr>
-            <w:tcW w:type="dxa" w:w="3120"/>
-            <w:tcMar>
-              <w:top w:w="100" w:type="dxa"/>
-              <w:bottom w:w="100" w:type="dxa"/>
-              <w:left w:w="150" w:type="dxa"/>
-              <w:right w:w="150" w:type="dxa"/>
-            </w:tcMar>
-            <w:shd w:fill="F2F4F7"/>
-          </w:tcPr>
-          <w:p>
-            <w:r>
-              <w:t>Qdrant / TF-IDF</w:t>
-            </w:r>
-          </w:p>
-        </w:tc>
-        <w:tc>
-          <w:tcPr>
-            <w:tcW w:type="dxa" w:w="3120"/>
-            <w:tcMar>
-              <w:top w:w="100" w:type="dxa"/>
-              <w:bottom w:w="100" w:type="dxa"/>
-              <w:left w:w="150" w:type="dxa"/>
-              <w:right w:w="150" w:type="dxa"/>
-            </w:tcMar>
-            <w:shd w:fill="F2F4F7"/>
-          </w:tcPr>
-          <w:p>
-            <w:r>
-              <w:t>Stores text embeddings of title and body strings. Runs Cosine similarity searches to provide contextually relevant recommendations.</w:t>
-            </w:r>
-          </w:p>
-        </w:tc>
-      </w:tr>
-    </w:tbl>
-    <w:p>
-      <w:r>
-        <w:br w:type="page"/>
-      </w:r>
-    </w:p>
-    <w:p>
-      <w:pPr>
-        <w:pStyle w:val="Heading1"/>
-      </w:pPr>
-      <w:r>
-        <w:rPr>
-          <w:color w:val="1B365D"/>
-        </w:rPr>
-        <w:t>3. System Design Concepts &amp; Algorithms</w:t>
+        <w:t>Modern knowledge platforms (like Quora, Stack Overflow, and Medium) operate at massive internet scales. These platforms are defined by a high read-to-write ratio, deeply connected user relationships (social graph), spiky real-time traffic (new posts and updates), and complex, unstructured content. Designing a system to serve this scale requires resolving major architectural trade-offs: data consistency vs. availability, latency vs. write-amplification, and exact-keyword matching vs. context-aware semantic search.</w:t>
       </w:r>
     </w:p>
     <w:p>
       <w:pPr>
         <w:pStyle w:val="Heading2"/>
+        <w:keepNext/>
+        <w:spacing w:before="240" w:after="120"/>
       </w:pPr>
       <w:r>
-        <w:t>Answer Ranking: Wilson Score Interval</w:t>
+        <w:rPr>
+          <w:rFonts w:ascii="Arial" w:hAnsi="Arial"/>
+          <w:b/>
+          <w:color w:val="5C768D"/>
+          <w:sz w:val="26"/>
+        </w:rPr>
+        <w:t>Functional Requirements (What the system does):</w:t>
       </w:r>
     </w:p>
     <w:p>
+      <w:pPr>
+        <w:pStyle w:val="ListBullet"/>
+        <w:spacing w:line="276" w:lineRule="auto" w:after="120"/>
+      </w:pPr>
       <w:r>
-        <w:t>A naive ranking method (e.g. upvotes / total_votes) fails when a post has 1 upvote and 0 downvotes (100% positive but low statistical significance). KnowHub uses the Wilson Score Interval (95% confidence):</w:t>
+        <w:rPr>
+          <w:rFonts w:ascii="Georgia" w:hAnsi="Georgia"/>
+          <w:sz w:val="21"/>
+        </w:rPr>
+        <w:t>Users can register, authenticate (JWT), follow other users, and follow specific topics of interest.</w:t>
       </w:r>
     </w:p>
     <w:p>
+      <w:pPr>
+        <w:pStyle w:val="ListBullet"/>
+        <w:spacing w:line="276" w:lineRule="auto" w:after="120"/>
+      </w:pPr>
       <w:r>
-        <w:t>Score = (p_hat + z^2/(2n) - z * sqrt((p_hat * (1 - p_hat) + z^2/(4n)) / n)) / (1 + z^2/n)</w:t>
-        <w:br/>
-        <w:t>Where p_hat = upvotes / total_votes, n = total_votes, and z = 1.96. This yields a statistically robust score, ranking answers mathematically based on consensus quality.</w:t>
+        <w:rPr>
+          <w:rFonts w:ascii="Georgia" w:hAnsi="Georgia"/>
+          <w:sz w:val="21"/>
+        </w:rPr>
+        <w:t>Users can post questions, submit answers, vote on answers (upvote/downvote), and write comments.</w:t>
+      </w:r>
+    </w:p>
+    <w:p>
+      <w:pPr>
+        <w:pStyle w:val="ListBullet"/>
+        <w:spacing w:line="276" w:lineRule="auto" w:after="120"/>
+      </w:pPr>
+      <w:r>
+        <w:rPr>
+          <w:rFonts w:ascii="Georgia" w:hAnsi="Georgia"/>
+          <w:sz w:val="21"/>
+        </w:rPr>
+        <w:t>Each user receives a personalized feed (timeline) built from their followed authors and topics.</w:t>
+      </w:r>
+    </w:p>
+    <w:p>
+      <w:pPr>
+        <w:pStyle w:val="ListBullet"/>
+        <w:spacing w:line="276" w:lineRule="auto" w:after="120"/>
+      </w:pPr>
+      <w:r>
+        <w:rPr>
+          <w:rFonts w:ascii="Georgia" w:hAnsi="Georgia"/>
+          <w:sz w:val="21"/>
+        </w:rPr>
+        <w:t>Users can search questions using a unified search bar featuring hybrid exact and semantic matching.</w:t>
+      </w:r>
+    </w:p>
+    <w:p>
+      <w:pPr>
+        <w:pStyle w:val="ListBullet"/>
+        <w:spacing w:line="276" w:lineRule="auto" w:after="120"/>
+      </w:pPr>
+      <w:r>
+        <w:rPr>
+          <w:rFonts w:ascii="Georgia" w:hAnsi="Georgia"/>
+          <w:sz w:val="21"/>
+        </w:rPr>
+        <w:t>Users receive real-time notifications via WebSockets whenever questions or answers are posted in their network.</w:t>
       </w:r>
     </w:p>
     <w:p>
       <w:pPr>
         <w:pStyle w:val="Heading2"/>
+        <w:keepNext/>
+        <w:spacing w:before="240" w:after="120"/>
       </w:pPr>
       <w:r>
-        <w:t>Feed Construction: Hybrid Push-Pull Model</w:t>
-      </w:r>
-    </w:p>
-    <w:p>
-      <w:r>
-        <w:t>• Push Path: When standard users post a question, the event publishes and immediately appends the post to their followers' feed timelines.</w:t>
-        <w:br/>
-        <w:t>• Pull Path: Celebrity authors (users with many followers) do not push. Instead, when a follower loads their feed, the system dynamically queries the celebrity's posts and merges them.</w:t>
-        <w:br/>
-        <w:t>This keeps write-amplification minimal while maintaining rapid feed load times.</w:t>
+        <w:rPr>
+          <w:rFonts w:ascii="Arial" w:hAnsi="Arial"/>
+          <w:b/>
+          <w:color w:val="5C768D"/>
+          <w:sz w:val="26"/>
+        </w:rPr>
+        <w:t>Non-Functional &amp; Scaling Requirements (How the system performs):</w:t>
       </w:r>
     </w:p>
     <w:p>
       <w:pPr>
-        <w:pStyle w:val="Heading2"/>
+        <w:pStyle w:val="ListBullet"/>
+        <w:spacing w:line="276" w:lineRule="auto" w:after="120"/>
       </w:pPr>
       <w:r>
-        <w:t>Search: Hybrid Lexical + Semantic Fusion</w:t>
+        <w:rPr>
+          <w:rFonts w:ascii="Georgia" w:hAnsi="Georgia"/>
+          <w:sz w:val="21"/>
+        </w:rPr>
+        <w:t>Low Latency Feed Loading: Timeline reads must execute in &lt; 100ms, even for highly connected user nodes.</w:t>
       </w:r>
     </w:p>
     <w:p>
+      <w:pPr>
+        <w:pStyle w:val="ListBullet"/>
+        <w:spacing w:line="276" w:lineRule="auto" w:after="120"/>
+      </w:pPr>
       <w:r>
-        <w:t>Search requests calculate two scores for every document:</w:t>
-        <w:br/>
-        <w:t>1. Lexical Score: Jaccard overlap similarity of search query tokens and document tokens.</w:t>
-        <w:br/>
-        <w:t>2. Semantic Score: Cosine similarity of the document's TF-IDF term vector against the search query.</w:t>
-        <w:br/>
-        <w:t>The final ranking is a weighted sum: Score = 0.3 * Lexical + 0.7 * Semantic, ensuring relevant, exact and contextual matches.</w:t>
+        <w:rPr>
+          <w:rFonts w:ascii="Georgia" w:hAnsi="Georgia"/>
+          <w:sz w:val="21"/>
+        </w:rPr>
+        <w:t>Avoid the Celebrity Bottleneck: Ensure that users posting content who have millions of followers do not exhaust system memory or create thread pools starvation.</w:t>
+      </w:r>
+    </w:p>
+    <w:p>
+      <w:pPr>
+        <w:pStyle w:val="ListBullet"/>
+        <w:spacing w:line="276" w:lineRule="auto" w:after="120"/>
+      </w:pPr>
+      <w:r>
+        <w:rPr>
+          <w:rFonts w:ascii="Georgia" w:hAnsi="Georgia"/>
+          <w:sz w:val="21"/>
+        </w:rPr>
+        <w:t>Statistically Robust Ranking: Answer sorting must reward quality and counter early-mover bias.</w:t>
+      </w:r>
+    </w:p>
+    <w:p>
+      <w:pPr>
+        <w:pStyle w:val="ListBullet"/>
+        <w:spacing w:line="276" w:lineRule="auto" w:after="120"/>
+      </w:pPr>
+      <w:r>
+        <w:rPr>
+          <w:rFonts w:ascii="Georgia" w:hAnsi="Georgia"/>
+          <w:sz w:val="21"/>
+        </w:rPr>
+        <w:t>High Availability: The websocket layer and notification delivery must remain robust during massive network events.</w:t>
       </w:r>
     </w:p>
     <w:p>
@@ -490,76 +242,994 @@
     <w:p>
       <w:pPr>
         <w:pStyle w:val="Heading1"/>
+        <w:keepNext/>
+        <w:spacing w:before="240" w:after="120"/>
       </w:pPr>
       <w:r>
         <w:rPr>
+          <w:rFonts w:ascii="Arial" w:hAnsi="Arial"/>
+          <w:b/>
           <w:color w:val="1B365D"/>
+          <w:sz w:val="32"/>
         </w:rPr>
-        <w:t>4. Operations, Observability &amp; Security</w:t>
+        <w:t>2. System Architecture &amp; Polyglot Persistence</w:t>
+      </w:r>
+    </w:p>
+    <w:p>
+      <w:pPr>
+        <w:spacing w:line="276" w:lineRule="auto" w:after="120"/>
+      </w:pPr>
+      <w:r>
+        <w:rPr>
+          <w:rFonts w:ascii="Georgia" w:hAnsi="Georgia"/>
+          <w:sz w:val="21"/>
+        </w:rPr>
+        <w:t>To satisfy the requirements of transaction safety, social-graph query performance, high-speed document partitions, and similarity indexing, KnowHub implements a polyglot persistence design. Rather than relying on a single monolithic database database, the system maps individual data types to specialized models:</w:t>
+      </w:r>
+    </w:p>
+    <w:tbl>
+      <w:tblPr>
+        <w:tblW w:type="auto" w:w="0"/>
+        <w:jc w:val="center"/>
+        <w:tblLook w:firstColumn="1" w:firstRow="1" w:lastColumn="0" w:lastRow="0" w:noHBand="0" w:noVBand="1" w:val="04A0"/>
+      </w:tblPr>
+      <w:tblGrid>
+        <w:gridCol w:w="2340"/>
+        <w:gridCol w:w="2340"/>
+        <w:gridCol w:w="2340"/>
+        <w:gridCol w:w="2340"/>
+      </w:tblGrid>
+      <w:tr>
+        <w:tc>
+          <w:tcPr>
+            <w:tcW w:type="dxa" w:w="2340"/>
+            <w:shd w:fill="1B365D"/>
+            <w:tcMar>
+              <w:top w:w="120" w:type="dxa"/>
+              <w:bottom w:w="120" w:type="dxa"/>
+              <w:left w:w="160" w:type="dxa"/>
+              <w:right w:w="160" w:type="dxa"/>
+            </w:tcMar>
+          </w:tcPr>
+          <w:p>
+            <w:r>
+              <w:rPr>
+                <w:rFonts w:ascii="Arial" w:hAnsi="Arial"/>
+                <w:b/>
+                <w:color w:val="FFFFFF"/>
+                <w:sz w:val="19"/>
+              </w:rPr>
+              <w:t>Storage Model</w:t>
+            </w:r>
+          </w:p>
+        </w:tc>
+        <w:tc>
+          <w:tcPr>
+            <w:tcW w:type="dxa" w:w="2340"/>
+            <w:shd w:fill="1B365D"/>
+            <w:tcMar>
+              <w:top w:w="120" w:type="dxa"/>
+              <w:bottom w:w="120" w:type="dxa"/>
+              <w:left w:w="160" w:type="dxa"/>
+              <w:right w:w="160" w:type="dxa"/>
+            </w:tcMar>
+          </w:tcPr>
+          <w:p>
+            <w:r>
+              <w:rPr>
+                <w:rFonts w:ascii="Arial" w:hAnsi="Arial"/>
+                <w:b/>
+                <w:color w:val="FFFFFF"/>
+                <w:sz w:val="19"/>
+              </w:rPr>
+              <w:t>Simulation Target</w:t>
+            </w:r>
+          </w:p>
+        </w:tc>
+        <w:tc>
+          <w:tcPr>
+            <w:tcW w:type="dxa" w:w="2340"/>
+            <w:shd w:fill="1B365D"/>
+            <w:tcMar>
+              <w:top w:w="120" w:type="dxa"/>
+              <w:bottom w:w="120" w:type="dxa"/>
+              <w:left w:w="160" w:type="dxa"/>
+              <w:right w:w="160" w:type="dxa"/>
+            </w:tcMar>
+          </w:tcPr>
+          <w:p>
+            <w:r>
+              <w:rPr>
+                <w:rFonts w:ascii="Arial" w:hAnsi="Arial"/>
+                <w:b/>
+                <w:color w:val="FFFFFF"/>
+                <w:sz w:val="19"/>
+              </w:rPr>
+              <w:t>Managed Entities</w:t>
+            </w:r>
+          </w:p>
+        </w:tc>
+        <w:tc>
+          <w:tcPr>
+            <w:tcW w:type="dxa" w:w="2340"/>
+            <w:shd w:fill="1B365D"/>
+            <w:tcMar>
+              <w:top w:w="120" w:type="dxa"/>
+              <w:bottom w:w="120" w:type="dxa"/>
+              <w:left w:w="160" w:type="dxa"/>
+              <w:right w:w="160" w:type="dxa"/>
+            </w:tcMar>
+          </w:tcPr>
+          <w:p>
+            <w:r>
+              <w:rPr>
+                <w:rFonts w:ascii="Arial" w:hAnsi="Arial"/>
+                <w:b/>
+                <w:color w:val="FFFFFF"/>
+                <w:sz w:val="19"/>
+              </w:rPr>
+              <w:t>Core Rationale</w:t>
+            </w:r>
+          </w:p>
+        </w:tc>
+      </w:tr>
+      <w:tr>
+        <w:tc>
+          <w:tcPr>
+            <w:tcW w:type="dxa" w:w="2340"/>
+            <w:tcMar>
+              <w:top w:w="120" w:type="dxa"/>
+              <w:bottom w:w="120" w:type="dxa"/>
+              <w:left w:w="160" w:type="dxa"/>
+              <w:right w:w="160" w:type="dxa"/>
+            </w:tcMar>
+          </w:tcPr>
+          <w:p>
+            <w:r>
+              <w:rPr>
+                <w:rFonts w:ascii="Georgia" w:hAnsi="Georgia"/>
+                <w:sz w:val="18"/>
+              </w:rPr>
+              <w:t>SQL (SQLite)</w:t>
+            </w:r>
+          </w:p>
+        </w:tc>
+        <w:tc>
+          <w:tcPr>
+            <w:tcW w:type="dxa" w:w="2340"/>
+            <w:tcMar>
+              <w:top w:w="120" w:type="dxa"/>
+              <w:bottom w:w="120" w:type="dxa"/>
+              <w:left w:w="160" w:type="dxa"/>
+              <w:right w:w="160" w:type="dxa"/>
+            </w:tcMar>
+          </w:tcPr>
+          <w:p>
+            <w:r>
+              <w:rPr>
+                <w:rFonts w:ascii="Georgia" w:hAnsi="Georgia"/>
+                <w:sz w:val="18"/>
+              </w:rPr>
+              <w:t>PostgreSQL</w:t>
+            </w:r>
+          </w:p>
+        </w:tc>
+        <w:tc>
+          <w:tcPr>
+            <w:tcW w:type="dxa" w:w="2340"/>
+            <w:tcMar>
+              <w:top w:w="120" w:type="dxa"/>
+              <w:bottom w:w="120" w:type="dxa"/>
+              <w:left w:w="160" w:type="dxa"/>
+              <w:right w:w="160" w:type="dxa"/>
+            </w:tcMar>
+          </w:tcPr>
+          <w:p>
+            <w:r>
+              <w:rPr>
+                <w:rFonts w:ascii="Georgia" w:hAnsi="Georgia"/>
+                <w:sz w:val="18"/>
+              </w:rPr>
+              <w:t>Users, Credentials, Topics</w:t>
+            </w:r>
+          </w:p>
+        </w:tc>
+        <w:tc>
+          <w:tcPr>
+            <w:tcW w:type="dxa" w:w="2340"/>
+            <w:tcMar>
+              <w:top w:w="120" w:type="dxa"/>
+              <w:bottom w:w="120" w:type="dxa"/>
+              <w:left w:w="160" w:type="dxa"/>
+              <w:right w:w="160" w:type="dxa"/>
+            </w:tcMar>
+          </w:tcPr>
+          <w:p>
+            <w:r>
+              <w:rPr>
+                <w:rFonts w:ascii="Georgia" w:hAnsi="Georgia"/>
+                <w:sz w:val="18"/>
+              </w:rPr>
+              <w:t>Enforces transactional integrity (ACID), unique emails/usernames, and structured entity relations.</w:t>
+            </w:r>
+          </w:p>
+        </w:tc>
+      </w:tr>
+      <w:tr>
+        <w:tc>
+          <w:tcPr>
+            <w:tcW w:type="dxa" w:w="2340"/>
+            <w:tcMar>
+              <w:top w:w="120" w:type="dxa"/>
+              <w:bottom w:w="120" w:type="dxa"/>
+              <w:left w:w="160" w:type="dxa"/>
+              <w:right w:w="160" w:type="dxa"/>
+            </w:tcMar>
+            <w:shd w:fill="F2F4F7"/>
+          </w:tcPr>
+          <w:p>
+            <w:r>
+              <w:rPr>
+                <w:rFonts w:ascii="Georgia" w:hAnsi="Georgia"/>
+                <w:sz w:val="18"/>
+              </w:rPr>
+              <w:t>NoSQL Partitioned</w:t>
+            </w:r>
+          </w:p>
+        </w:tc>
+        <w:tc>
+          <w:tcPr>
+            <w:tcW w:type="dxa" w:w="2340"/>
+            <w:tcMar>
+              <w:top w:w="120" w:type="dxa"/>
+              <w:bottom w:w="120" w:type="dxa"/>
+              <w:left w:w="160" w:type="dxa"/>
+              <w:right w:w="160" w:type="dxa"/>
+            </w:tcMar>
+            <w:shd w:fill="F2F4F7"/>
+          </w:tcPr>
+          <w:p>
+            <w:r>
+              <w:rPr>
+                <w:rFonts w:ascii="Georgia" w:hAnsi="Georgia"/>
+                <w:sz w:val="18"/>
+              </w:rPr>
+              <w:t>Apache Cassandra</w:t>
+            </w:r>
+          </w:p>
+        </w:tc>
+        <w:tc>
+          <w:tcPr>
+            <w:tcW w:type="dxa" w:w="2340"/>
+            <w:tcMar>
+              <w:top w:w="120" w:type="dxa"/>
+              <w:bottom w:w="120" w:type="dxa"/>
+              <w:left w:w="160" w:type="dxa"/>
+              <w:right w:w="160" w:type="dxa"/>
+            </w:tcMar>
+            <w:shd w:fill="F2F4F7"/>
+          </w:tcPr>
+          <w:p>
+            <w:r>
+              <w:rPr>
+                <w:rFonts w:ascii="Georgia" w:hAnsi="Georgia"/>
+                <w:sz w:val="18"/>
+              </w:rPr>
+              <w:t>Answers, Comments</w:t>
+            </w:r>
+          </w:p>
+        </w:tc>
+        <w:tc>
+          <w:tcPr>
+            <w:tcW w:type="dxa" w:w="2340"/>
+            <w:tcMar>
+              <w:top w:w="120" w:type="dxa"/>
+              <w:bottom w:w="120" w:type="dxa"/>
+              <w:left w:w="160" w:type="dxa"/>
+              <w:right w:w="160" w:type="dxa"/>
+            </w:tcMar>
+            <w:shd w:fill="F2F4F7"/>
+          </w:tcPr>
+          <w:p>
+            <w:r>
+              <w:rPr>
+                <w:rFonts w:ascii="Georgia" w:hAnsi="Georgia"/>
+                <w:sz w:val="18"/>
+              </w:rPr>
+              <w:t>Organized by hash of question_id. Enables dynamic document properties and O(1) writes/reads without heavy SQL joins.</w:t>
+            </w:r>
+          </w:p>
+        </w:tc>
+      </w:tr>
+      <w:tr>
+        <w:tc>
+          <w:tcPr>
+            <w:tcW w:type="dxa" w:w="2340"/>
+            <w:tcMar>
+              <w:top w:w="120" w:type="dxa"/>
+              <w:bottom w:w="120" w:type="dxa"/>
+              <w:left w:w="160" w:type="dxa"/>
+              <w:right w:w="160" w:type="dxa"/>
+            </w:tcMar>
+          </w:tcPr>
+          <w:p>
+            <w:r>
+              <w:rPr>
+                <w:rFonts w:ascii="Georgia" w:hAnsi="Georgia"/>
+                <w:sz w:val="18"/>
+              </w:rPr>
+              <w:t>Graph Engine</w:t>
+            </w:r>
+          </w:p>
+        </w:tc>
+        <w:tc>
+          <w:tcPr>
+            <w:tcW w:type="dxa" w:w="2340"/>
+            <w:tcMar>
+              <w:top w:w="120" w:type="dxa"/>
+              <w:bottom w:w="120" w:type="dxa"/>
+              <w:left w:w="160" w:type="dxa"/>
+              <w:right w:w="160" w:type="dxa"/>
+            </w:tcMar>
+          </w:tcPr>
+          <w:p>
+            <w:r>
+              <w:rPr>
+                <w:rFonts w:ascii="Georgia" w:hAnsi="Georgia"/>
+                <w:sz w:val="18"/>
+              </w:rPr>
+              <w:t>Neo4j / JanusGraph</w:t>
+            </w:r>
+          </w:p>
+        </w:tc>
+        <w:tc>
+          <w:tcPr>
+            <w:tcW w:type="dxa" w:w="2340"/>
+            <w:tcMar>
+              <w:top w:w="120" w:type="dxa"/>
+              <w:bottom w:w="120" w:type="dxa"/>
+              <w:left w:w="160" w:type="dxa"/>
+              <w:right w:w="160" w:type="dxa"/>
+            </w:tcMar>
+          </w:tcPr>
+          <w:p>
+            <w:r>
+              <w:rPr>
+                <w:rFonts w:ascii="Georgia" w:hAnsi="Georgia"/>
+                <w:sz w:val="18"/>
+              </w:rPr>
+              <w:t>Follows, Subscriptions</w:t>
+            </w:r>
+          </w:p>
+        </w:tc>
+        <w:tc>
+          <w:tcPr>
+            <w:tcW w:type="dxa" w:w="2340"/>
+            <w:tcMar>
+              <w:top w:w="120" w:type="dxa"/>
+              <w:bottom w:w="120" w:type="dxa"/>
+              <w:left w:w="160" w:type="dxa"/>
+              <w:right w:w="160" w:type="dxa"/>
+            </w:tcMar>
+          </w:tcPr>
+          <w:p>
+            <w:r>
+              <w:rPr>
+                <w:rFonts w:ascii="Georgia" w:hAnsi="Georgia"/>
+                <w:sz w:val="18"/>
+              </w:rPr>
+              <w:t>Tracks follow networks and subscriptions. Adjacency lists prevent nested SQL joins during deep traversal loops.</w:t>
+            </w:r>
+          </w:p>
+        </w:tc>
+      </w:tr>
+      <w:tr>
+        <w:tc>
+          <w:tcPr>
+            <w:tcW w:type="dxa" w:w="2340"/>
+            <w:tcMar>
+              <w:top w:w="120" w:type="dxa"/>
+              <w:bottom w:w="120" w:type="dxa"/>
+              <w:left w:w="160" w:type="dxa"/>
+              <w:right w:w="160" w:type="dxa"/>
+            </w:tcMar>
+            <w:shd w:fill="F2F4F7"/>
+          </w:tcPr>
+          <w:p>
+            <w:r>
+              <w:rPr>
+                <w:rFonts w:ascii="Georgia" w:hAnsi="Georgia"/>
+                <w:sz w:val="18"/>
+              </w:rPr>
+              <w:t>Vector Database</w:t>
+            </w:r>
+          </w:p>
+        </w:tc>
+        <w:tc>
+          <w:tcPr>
+            <w:tcW w:type="dxa" w:w="2340"/>
+            <w:tcMar>
+              <w:top w:w="120" w:type="dxa"/>
+              <w:bottom w:w="120" w:type="dxa"/>
+              <w:left w:w="160" w:type="dxa"/>
+              <w:right w:w="160" w:type="dxa"/>
+            </w:tcMar>
+            <w:shd w:fill="F2F4F7"/>
+          </w:tcPr>
+          <w:p>
+            <w:r>
+              <w:rPr>
+                <w:rFonts w:ascii="Georgia" w:hAnsi="Georgia"/>
+                <w:sz w:val="18"/>
+              </w:rPr>
+              <w:t>Qdrant / Pinecone</w:t>
+            </w:r>
+          </w:p>
+        </w:tc>
+        <w:tc>
+          <w:tcPr>
+            <w:tcW w:type="dxa" w:w="2340"/>
+            <w:tcMar>
+              <w:top w:w="120" w:type="dxa"/>
+              <w:bottom w:w="120" w:type="dxa"/>
+              <w:left w:w="160" w:type="dxa"/>
+              <w:right w:w="160" w:type="dxa"/>
+            </w:tcMar>
+            <w:shd w:fill="F2F4F7"/>
+          </w:tcPr>
+          <w:p>
+            <w:r>
+              <w:rPr>
+                <w:rFonts w:ascii="Georgia" w:hAnsi="Georgia"/>
+                <w:sz w:val="18"/>
+              </w:rPr>
+              <w:t>Text TF-IDF Vectors</w:t>
+            </w:r>
+          </w:p>
+        </w:tc>
+        <w:tc>
+          <w:tcPr>
+            <w:tcW w:type="dxa" w:w="2340"/>
+            <w:tcMar>
+              <w:top w:w="120" w:type="dxa"/>
+              <w:bottom w:w="120" w:type="dxa"/>
+              <w:left w:w="160" w:type="dxa"/>
+              <w:right w:w="160" w:type="dxa"/>
+            </w:tcMar>
+            <w:shd w:fill="F2F4F7"/>
+          </w:tcPr>
+          <w:p>
+            <w:r>
+              <w:rPr>
+                <w:rFonts w:ascii="Georgia" w:hAnsi="Georgia"/>
+                <w:sz w:val="18"/>
+              </w:rPr>
+              <w:t>Indexes document term-frequencies. Conducts cosine-similarity comparisons for semantic searching.</w:t>
+            </w:r>
+          </w:p>
+        </w:tc>
+      </w:tr>
+    </w:tbl>
+    <w:p>
+      <w:pPr>
+        <w:spacing w:line="276" w:lineRule="auto" w:after="120"/>
+      </w:pPr>
+      <w:r>
+        <w:rPr>
+          <w:rFonts w:ascii="Georgia" w:hAnsi="Georgia"/>
+          <w:sz w:val="21"/>
+        </w:rPr>
       </w:r>
     </w:p>
     <w:p>
       <w:pPr>
         <w:pStyle w:val="Heading2"/>
+        <w:keepNext/>
+        <w:spacing w:before="240" w:after="120"/>
       </w:pPr>
       <w:r>
-        <w:t>WebSocket Architecture &amp; Security</w:t>
+        <w:rPr>
+          <w:rFonts w:ascii="Arial" w:hAnsi="Arial"/>
+          <w:b/>
+          <w:color w:val="5C768D"/>
+          <w:sz w:val="26"/>
+        </w:rPr>
+        <w:t>Data Schemas &amp; Enforcements</w:t>
+      </w:r>
+    </w:p>
+    <w:p>
+      <w:pPr>
+        <w:spacing w:line="276" w:lineRule="auto" w:after="120"/>
+      </w:pPr>
+      <w:r>
+        <w:rPr>
+          <w:rFonts w:ascii="Georgia" w:hAnsi="Georgia"/>
+          <w:sz w:val="21"/>
+        </w:rPr>
+        <w:t>• SQL Schema: The relational schema enforces unique indexes on User emails and usernames, storing hashed passwords for verification. Topics are indexed via unique alphanumeric IDs.</w:t>
+        <w:br/>
+        <w:t>• NoSQL Document Structure: Answers are modeled as document dictionary records. Comments contain parent-mappings, allowing endless threading nested under questions or answers.</w:t>
+        <w:br/>
+        <w:t>• Graph Adjacency: The followers graph in graph_db.py maps user_id -&gt; followers (set of user_ids) and user_id -&gt; following (set of user_ids), creating bi-directional indexing.</w:t>
       </w:r>
     </w:p>
     <w:p>
       <w:r>
-        <w:t>Real-time alerts use WebSockets (?token=...). The incoming connection verifies the JWT signature, rejects unauthorized connections (close code 4001), and enforces a rate limit of 10 concurrent connections per IP address (close code 1008).</w:t>
+        <w:br w:type="page"/>
+      </w:r>
+    </w:p>
+    <w:p>
+      <w:pPr>
+        <w:pStyle w:val="Heading1"/>
+        <w:keepNext/>
+        <w:spacing w:before="240" w:after="120"/>
+      </w:pPr>
+      <w:r>
+        <w:rPr>
+          <w:rFonts w:ascii="Arial" w:hAnsi="Arial"/>
+          <w:b/>
+          <w:color w:val="1B365D"/>
+          <w:sz w:val="32"/>
+        </w:rPr>
+        <w:t>3. System Design Concepts &amp; Technical Rationale</w:t>
       </w:r>
     </w:p>
     <w:p>
       <w:pPr>
         <w:pStyle w:val="Heading2"/>
+        <w:keepNext/>
+        <w:spacing w:before="240" w:after="120"/>
       </w:pPr>
       <w:r>
-        <w:t>Observability &amp; Structured Logging</w:t>
+        <w:rPr>
+          <w:rFonts w:ascii="Arial" w:hAnsi="Arial"/>
+          <w:b/>
+          <w:color w:val="5C768D"/>
+          <w:sz w:val="26"/>
+        </w:rPr>
+        <w:t>3.1 Network Protocols &amp; Storage (HTTP vs WebSockets)</w:t>
+      </w:r>
+    </w:p>
+    <w:p>
+      <w:pPr>
+        <w:spacing w:line="276" w:lineRule="auto" w:after="120"/>
+      </w:pPr>
+      <w:r>
+        <w:rPr>
+          <w:rFonts w:ascii="Georgia" w:hAnsi="Georgia"/>
+          <w:sz w:val="21"/>
+        </w:rPr>
+        <w:t>HTTP is a stateless, request-response protocol designed on top of TCP. In KnowHub, RESTful API endpoints handle standard CRUD actions (like logging in, registering, writing a post, or upvoting). However, HTTP is half-duplex: the server cannot push unsolicited updates. To deliver real-time notifications without polling, KnowHub implements WebSockets. A WebSocket starts as an HTTP request with an Upgrade header, establishing a long-lived, full-duplex TCP stream. This allows the server to broadcast new event notifications to connected users with sub-millisecond latencies.</w:t>
+      </w:r>
+    </w:p>
+    <w:p>
+      <w:pPr>
+        <w:pStyle w:val="Heading2"/>
+        <w:keepNext/>
+        <w:spacing w:before="240" w:after="120"/>
+      </w:pPr>
+      <w:r>
+        <w:rPr>
+          <w:rFonts w:ascii="Arial" w:hAnsi="Arial"/>
+          <w:b/>
+          <w:color w:val="5C768D"/>
+          <w:sz w:val="26"/>
+        </w:rPr>
+        <w:t>3.2 System Metrics: Latency, Throughput, and Availability</w:t>
+      </w:r>
+    </w:p>
+    <w:p>
+      <w:pPr>
+        <w:spacing w:line="276" w:lineRule="auto" w:after="120"/>
+      </w:pPr>
+      <w:r>
+        <w:rPr>
+          <w:rFonts w:ascii="Georgia" w:hAnsi="Georgia"/>
+          <w:sz w:val="21"/>
+        </w:rPr>
+        <w:t>Latency is the time taken to process a request (measured at percentiles: p95, p99). Throughput is the number of transactions processed per second. Availability measures uptime (e.g., 99.99%). KnowHub tracks these using Prometheus middleware: it measures the request duration histogram (latency) and total request count (throughput). By offloading real-time events to an EventBus, we ensure API route latency remains low, preserving high throughput.</w:t>
+      </w:r>
+    </w:p>
+    <w:p>
+      <w:pPr>
+        <w:pStyle w:val="Heading2"/>
+        <w:keepNext/>
+        <w:spacing w:before="240" w:after="120"/>
+      </w:pPr>
+      <w:r>
+        <w:rPr>
+          <w:rFonts w:ascii="Arial" w:hAnsi="Arial"/>
+          <w:b/>
+          <w:color w:val="5C768D"/>
+          <w:sz w:val="26"/>
+        </w:rPr>
+        <w:t>3.3 SQL vs NoSQL, Replication &amp; Sharding</w:t>
+      </w:r>
+    </w:p>
+    <w:p>
+      <w:pPr>
+        <w:spacing w:line="276" w:lineRule="auto" w:after="120"/>
+      </w:pPr>
+      <w:r>
+        <w:rPr>
+          <w:rFonts w:ascii="Georgia" w:hAnsi="Georgia"/>
+          <w:sz w:val="21"/>
+        </w:rPr>
+        <w:t>SQL databases prioritize Consistency and Isolation (ACID transactions), using rigid table definitions. NoSQL systems scale horizontally by relaxing ACID to Eventual Consistency (BASE: Basically Available, Soft state, Eventual consistency). In a distributed system, sharding splits data horizontally across servers using a sharding key. KnowHub's NoSQL layer partitions answers using the hash of question_id. This simulates Cassandra's partition-key hashing, guaranteeing that all answers for a single question reside on the same partition (or directory), maximizing read speeds.</w:t>
+      </w:r>
+    </w:p>
+    <w:p>
+      <w:pPr>
+        <w:pStyle w:val="Heading2"/>
+        <w:keepNext/>
+        <w:spacing w:before="240" w:after="120"/>
+      </w:pPr>
+      <w:r>
+        <w:rPr>
+          <w:rFonts w:ascii="Arial" w:hAnsi="Arial"/>
+          <w:b/>
+          <w:color w:val="5C768D"/>
+          <w:sz w:val="26"/>
+        </w:rPr>
+        <w:t>3.4 Distributed Consensus, CAP Theorem &amp; Gossip Protocols</w:t>
+      </w:r>
+    </w:p>
+    <w:p>
+      <w:pPr>
+        <w:spacing w:line="276" w:lineRule="auto" w:after="120"/>
+      </w:pPr>
+      <w:r>
+        <w:rPr>
+          <w:rFonts w:ascii="Georgia" w:hAnsi="Georgia"/>
+          <w:sz w:val="21"/>
+        </w:rPr>
+        <w:t>Distributed consensus protocols (such as Raft or Paxos) ensure that a cluster of servers agrees on a shared state, electing a leader and replicating logs. In a network partition, the CAP Theorem dictates choosing Consistency or Availability. KnowHub splits this trade-off: SQL writes are Consistent (CP), while feed timelines and notifications prioritize Availability (AP). Gossip Protocols simulate decentralized node communication, sharing membership states across nodes; the EventBus pub/sub model represents an event-driven mechanism to broadcast state change events dynamically.</w:t>
+      </w:r>
+    </w:p>
+    <w:p>
+      <w:pPr>
+        <w:pStyle w:val="Heading2"/>
+        <w:keepNext/>
+        <w:spacing w:before="240" w:after="120"/>
+      </w:pPr>
+      <w:r>
+        <w:rPr>
+          <w:rFonts w:ascii="Arial" w:hAnsi="Arial"/>
+          <w:b/>
+          <w:color w:val="5C768D"/>
+          <w:sz w:val="26"/>
+        </w:rPr>
+        <w:t>3.5 Message Queues vs Streams (Kafka vs RabbitMQ)</w:t>
+      </w:r>
+    </w:p>
+    <w:p>
+      <w:pPr>
+        <w:spacing w:line="276" w:lineRule="auto" w:after="120"/>
+      </w:pPr>
+      <w:r>
+        <w:rPr>
+          <w:rFonts w:ascii="Georgia" w:hAnsi="Georgia"/>
+          <w:sz w:val="21"/>
+        </w:rPr>
+        <w:t>In a standard message queue (e.g. RabbitMQ), a message is deleted as soon as it is processed by a consumer. In a message stream (e.g. Apache Kafka), events are written to an append-only commit log and persisted, allowing multiple consumer groups to read and reply at their own paces. KnowHub's EventBus utilizes a fan-out stream architecture: every subscriber obtains their own queue, so when a new question or answer is published, every subscriber's queue receives a copy. This allows multiple concurrent WebSockets to monitor the same events without message loss.</w:t>
+      </w:r>
+    </w:p>
+    <w:p>
+      <w:pPr>
+        <w:pStyle w:val="Heading2"/>
+        <w:keepNext/>
+        <w:spacing w:before="240" w:after="120"/>
+      </w:pPr>
+      <w:r>
+        <w:rPr>
+          <w:rFonts w:ascii="Arial" w:hAnsi="Arial"/>
+          <w:b/>
+          <w:color w:val="5C768D"/>
+          <w:sz w:val="26"/>
+        </w:rPr>
+        <w:t>3.6 Microservices Patterns: Saga, CQRS &amp; API Gateways</w:t>
+      </w:r>
+    </w:p>
+    <w:p>
+      <w:pPr>
+        <w:spacing w:line="276" w:lineRule="auto" w:after="120"/>
+      </w:pPr>
+      <w:r>
+        <w:rPr>
+          <w:rFonts w:ascii="Georgia" w:hAnsi="Georgia"/>
+          <w:sz w:val="21"/>
+        </w:rPr>
+        <w:t>• CQRS (Command Query Responsibility Segregation): Segregates read and write operations. KnowHub writes to SQL and NoSQL, but reads feeds and searches from a pre-calculated index.</w:t>
+        <w:br/>
+        <w:t>• Saga Pattern: Coordinates distributed transactions using a sequence of local transactions. If a step fails, compensating transactions undo the previous changes. In KnowHub, posting a question writes to SQL and Vector DB; if the vector database insertion fails, we log and can trigger deletion in SQL.</w:t>
+        <w:br/>
+        <w:t>• API Gateway: Acts as a single entry point (FastAPI in main.py) handling routing, rate limiting, and JWT authentication.</w:t>
       </w:r>
     </w:p>
     <w:p>
       <w:r>
-        <w:t>• Structured Logging: Written to stdout/file in JSON format using Loguru.</w:t>
-        <w:br/>
-        <w:t>• System Metrics: Exposed via the /metrics endpoint, scraped by Prometheus to track HTTP request count, path latencies, and WebSocket states.</w:t>
+        <w:br w:type="page"/>
       </w:r>
     </w:p>
     <w:p>
       <w:pPr>
         <w:pStyle w:val="Heading1"/>
+        <w:keepNext/>
+        <w:spacing w:before="240" w:after="120"/>
       </w:pPr>
       <w:r>
         <w:rPr>
+          <w:rFonts w:ascii="Arial" w:hAnsi="Arial"/>
+          <w:b/>
           <w:color w:val="1B365D"/>
+          <w:sz w:val="32"/>
         </w:rPr>
-        <w:t>5. Operations &amp; Local Setup Guide</w:t>
+        <w:t>4. Key Algorithms &amp; Systems Engineering</w:t>
+      </w:r>
+    </w:p>
+    <w:p>
+      <w:pPr>
+        <w:pStyle w:val="Heading2"/>
+        <w:keepNext/>
+        <w:spacing w:before="240" w:after="120"/>
+      </w:pPr>
+      <w:r>
+        <w:rPr>
+          <w:rFonts w:ascii="Arial" w:hAnsi="Arial"/>
+          <w:b/>
+          <w:color w:val="5C768D"/>
+          <w:sz w:val="26"/>
+        </w:rPr>
+        <w:t>4.1 Wilson Score Interval for Answer Sorting</w:t>
+      </w:r>
+    </w:p>
+    <w:p>
+      <w:pPr>
+        <w:spacing w:line="276" w:lineRule="auto" w:after="120"/>
+      </w:pPr>
+      <w:r>
+        <w:rPr>
+          <w:rFonts w:ascii="Georgia" w:hAnsi="Georgia"/>
+          <w:sz w:val="21"/>
+        </w:rPr>
+        <w:t>Most platforms rank posts by calculating upvotes minus downvotes (which biases towards older posts with traffic) or upvotes divided by total votes (which inflates a post with 1 upvote and 0 downvotes). KnowHub uses the Wilson Score Interval (95% confidence) to compute a score:</w:t>
+      </w:r>
+    </w:p>
+    <w:p>
+      <w:pPr>
+        <w:spacing w:line="276" w:lineRule="auto" w:after="120"/>
+      </w:pPr>
+      <w:r>
+        <w:rPr>
+          <w:rFonts w:ascii="Georgia" w:hAnsi="Georgia"/>
+          <w:sz w:val="21"/>
+        </w:rPr>
+        <w:t>Let p_hat = upvotes / n, where n = upvotes + downvotes. Let z = 1.96 (for 95% confidence). Wilson Score = (p_hat + z^2/(2n) - z * sqrt((p_hat*(1-p_hat) + z^2/(4n))/n)) / (1 + z^2/n).This algorithm computes the lower statistical boundary of positive feedback, balancing the ranking of high-volume posts and newly posted items with high initial positive ratings.</w:t>
+      </w:r>
+    </w:p>
+    <w:p>
+      <w:pPr>
+        <w:pStyle w:val="Heading2"/>
+        <w:keepNext/>
+        <w:spacing w:before="240" w:after="120"/>
+      </w:pPr>
+      <w:r>
+        <w:rPr>
+          <w:rFonts w:ascii="Arial" w:hAnsi="Arial"/>
+          <w:b/>
+          <w:color w:val="5C768D"/>
+          <w:sz w:val="26"/>
+        </w:rPr>
+        <w:t>4.2 Hybrid Push-Pull Feed Timeline Generation</w:t>
+      </w:r>
+    </w:p>
+    <w:p>
+      <w:pPr>
+        <w:spacing w:line="276" w:lineRule="auto" w:after="120"/>
+      </w:pPr>
+      <w:r>
+        <w:rPr>
+          <w:rFonts w:ascii="Georgia" w:hAnsi="Georgia"/>
+          <w:sz w:val="21"/>
+        </w:rPr>
+        <w:t>• Push Path (Fan-out on Write): When a standard user (follower count &lt; 1,000) posts a question, it is immediately written to the feeds of all their followers. This keeps read latency extremely low.</w:t>
+        <w:br/>
+        <w:t>• Pull Path (Fan-out on Read): If a celebrity (follower count &gt;= 1,000) posts, writing to millions of follower feeds would crash the system. Instead, the post is saved locally. When a follower requests their feed, the system dynamically pulls the celebrity's recent posts and merges them with the pre-computed feed.</w:t>
+        <w:br/>
+        <w:t>This hybrid solution optimizes both resource consumption and latency.</w:t>
+      </w:r>
+    </w:p>
+    <w:p>
+      <w:pPr>
+        <w:pStyle w:val="Heading2"/>
+        <w:keepNext/>
+        <w:spacing w:before="240" w:after="120"/>
+      </w:pPr>
+      <w:r>
+        <w:rPr>
+          <w:rFonts w:ascii="Arial" w:hAnsi="Arial"/>
+          <w:b/>
+          <w:color w:val="5C768D"/>
+          <w:sz w:val="26"/>
+        </w:rPr>
+        <w:t>4.3 Hybrid Lexical + Semantic Search Fusion</w:t>
+      </w:r>
+    </w:p>
+    <w:p>
+      <w:pPr>
+        <w:spacing w:line="276" w:lineRule="auto" w:after="120"/>
+      </w:pPr>
+      <w:r>
+        <w:rPr>
+          <w:rFonts w:ascii="Georgia" w:hAnsi="Georgia"/>
+          <w:sz w:val="21"/>
+        </w:rPr>
+        <w:t>KnowHub fuses keyword matching and contextual semantics:</w:t>
+        <w:br/>
+        <w:t>1. Lexical Similarity: Compares overlap of tokens using the Jaccard distance.</w:t>
+        <w:br/>
+        <w:t>2. Semantic Similarity: Computes TF-IDF term vectors for all documents and query strings, calculating the Cosine similarity.</w:t>
+        <w:br/>
+        <w:t>3. Score Fusion: The system merges scores: Final_Score = 0.3 * Lexical + 0.7 * Semantic, ensuring relevant search results.</w:t>
       </w:r>
     </w:p>
     <w:p>
       <w:r>
-        <w:t>To run KnowHub locally:</w:t>
+        <w:br w:type="page"/>
       </w:r>
     </w:p>
     <w:p>
+      <w:pPr>
+        <w:pStyle w:val="Heading1"/>
+        <w:keepNext/>
+        <w:spacing w:before="240" w:after="120"/>
+      </w:pPr>
       <w:r>
-        <w:t>1. Install requirements: pip install -r requirements.txt</w:t>
+        <w:rPr>
+          <w:rFonts w:ascii="Arial" w:hAnsi="Arial"/>
+          <w:b/>
+          <w:color w:val="1B365D"/>
+          <w:sz w:val="32"/>
+        </w:rPr>
+        <w:t>5. Operations, Security &amp; Verification</w:t>
       </w:r>
     </w:p>
     <w:p>
+      <w:pPr>
+        <w:pStyle w:val="Heading2"/>
+        <w:keepNext/>
+        <w:spacing w:before="240" w:after="120"/>
+      </w:pPr>
       <w:r>
-        <w:t>2. Start backend: uvicorn main:app --reload --host 127.0.0.1 --port 8000</w:t>
+        <w:rPr>
+          <w:rFonts w:ascii="Arial" w:hAnsi="Arial"/>
+          <w:b/>
+          <w:color w:val="5C768D"/>
+          <w:sz w:val="26"/>
+        </w:rPr>
+        <w:t>5.1 Authentication, JWT, and WebSocket Security</w:t>
       </w:r>
     </w:p>
     <w:p>
+      <w:pPr>
+        <w:spacing w:line="276" w:lineRule="auto" w:after="120"/>
+      </w:pPr>
       <w:r>
-        <w:t>3. Build frontend: cd frontend &amp;&amp; npm install &amp;&amp; npm run dev</w:t>
+        <w:rPr>
+          <w:rFonts w:ascii="Georgia" w:hAnsi="Georgia"/>
+          <w:sz w:val="21"/>
+        </w:rPr>
+        <w:t>• REST APIs: Uses JSON Web Tokens (JWT). The signature is validated using the HS256 algorithm and a server secret key.</w:t>
+        <w:br/>
+        <w:t>• WebSocket Security: Browsers do not support custom headers in the WebSocket API. KnowHub secures connections by sending the JWT as a query parameter (ws://.../ws?token=&lt;JWT&gt;). The server validates the token on handshake. If invalid, it terminates the connection with code 4001.</w:t>
+        <w:br/>
+        <w:t>• Rate Limiting: Uses a sliding window mechanism. It limits WebSocket connections to 10 concurrent sessions per IP, rejecting excess requests with code 1008.</w:t>
       </w:r>
     </w:p>
     <w:p>
+      <w:pPr>
+        <w:pStyle w:val="Heading2"/>
+        <w:keepNext/>
+        <w:spacing w:before="240" w:after="120"/>
+      </w:pPr>
       <w:r>
-        <w:t>4. Build with Docker: docker compose up --build -d</w:t>
+        <w:rPr>
+          <w:rFonts w:ascii="Arial" w:hAnsi="Arial"/>
+          <w:b/>
+          <w:color w:val="5C768D"/>
+          <w:sz w:val="26"/>
+        </w:rPr>
+        <w:t>5.2 Observability: Centralized Logging &amp; Prometheus Metrics</w:t>
+      </w:r>
+    </w:p>
+    <w:p>
+      <w:pPr>
+        <w:spacing w:line="276" w:lineRule="auto" w:after="120"/>
+      </w:pPr>
+      <w:r>
+        <w:rPr>
+          <w:rFonts w:ascii="Georgia" w:hAnsi="Georgia"/>
+          <w:sz w:val="21"/>
+        </w:rPr>
+        <w:t>• Logging: Implements structured JSON logging via Loguru, facilitating search queries in ELK or Grafana Loki.</w:t>
+        <w:br/>
+        <w:t>• Metrics: Prometheus scrapes the /metrics endpoint. Custom gauges track active WebSocket connections and connected users, while built-in instruments track HTTP request latencies and error rates.</w:t>
+      </w:r>
+    </w:p>
+    <w:p>
+      <w:pPr>
+        <w:pStyle w:val="Heading2"/>
+        <w:keepNext/>
+        <w:spacing w:before="240" w:after="120"/>
+      </w:pPr>
+      <w:r>
+        <w:rPr>
+          <w:rFonts w:ascii="Arial" w:hAnsi="Arial"/>
+          <w:b/>
+          <w:color w:val="5C768D"/>
+          <w:sz w:val="26"/>
+        </w:rPr>
+        <w:t>5.3 Running the System Locally</w:t>
+      </w:r>
+    </w:p>
+    <w:p>
+      <w:pPr>
+        <w:spacing w:line="276" w:lineRule="auto" w:after="120"/>
+      </w:pPr>
+      <w:r>
+        <w:rPr>
+          <w:rFonts w:ascii="Georgia" w:hAnsi="Georgia"/>
+          <w:sz w:val="21"/>
+        </w:rPr>
+        <w:t>To run the full stack locally, follow these steps:</w:t>
+      </w:r>
+    </w:p>
+    <w:p>
+      <w:pPr>
+        <w:spacing w:line="276" w:lineRule="auto" w:after="120"/>
+      </w:pPr>
+      <w:r>
+        <w:rPr>
+          <w:rFonts w:ascii="Georgia" w:hAnsi="Georgia"/>
+          <w:sz w:val="21"/>
+        </w:rPr>
+        <w:t>1. Configure the environment variables using .env.example: cp .env.example .env</w:t>
+      </w:r>
+    </w:p>
+    <w:p>
+      <w:pPr>
+        <w:spacing w:line="276" w:lineRule="auto" w:after="120"/>
+      </w:pPr>
+      <w:r>
+        <w:rPr>
+          <w:rFonts w:ascii="Georgia" w:hAnsi="Georgia"/>
+          <w:sz w:val="21"/>
+        </w:rPr>
+        <w:t>2. Start the FastAPI backend: pip install -r requirements.txt &amp;&amp; uvicorn main:app --reload</w:t>
+      </w:r>
+    </w:p>
+    <w:p>
+      <w:pPr>
+        <w:spacing w:line="276" w:lineRule="auto" w:after="120"/>
+      </w:pPr>
+      <w:r>
+        <w:rPr>
+          <w:rFonts w:ascii="Georgia" w:hAnsi="Georgia"/>
+          <w:sz w:val="21"/>
+        </w:rPr>
+        <w:t>3. Start the React frontend: cd frontend &amp;&amp; npm install &amp;&amp; npm run dev</w:t>
+      </w:r>
+    </w:p>
+    <w:p>
+      <w:pPr>
+        <w:spacing w:line="276" w:lineRule="auto" w:after="120"/>
+      </w:pPr>
+      <w:r>
+        <w:rPr>
+          <w:rFonts w:ascii="Georgia" w:hAnsi="Georgia"/>
+          <w:sz w:val="21"/>
+        </w:rPr>
+        <w:t>4. Start with Docker Compose: docker compose up --build -d</w:t>
       </w:r>
     </w:p>
     <w:sectPr>
@@ -935,11 +1605,6 @@
     <w:name w:val="Normal"/>
     <w:qFormat/>
     <w:rsid w:val="00FC693F"/>
-    <w:rPr>
-      <w:rFonts w:ascii="Georgia" w:hAnsi="Georgia"/>
-      <w:color w:val="2B2B2B"/>
-      <w:sz w:val="21"/>
-    </w:rPr>
   </w:style>
   <w:style w:type="paragraph" w:styleId="Header">
     <w:name w:val="header"/>

</xml_diff>